<commit_message>
docs: memperbarui kuis formatif
</commit_message>
<xml_diff>
--- a/pertemuan ke 3 algoritma.docx
+++ b/pertemuan ke 3 algoritma.docx
@@ -188,6 +188,7 @@
           <w:ilvl w:val="0"/>
           <w:numId w:val="0"/>
         </w:numPr>
+        <w:shd w:val="clear" w:color="auto" w:fill="FFFF00"/>
         <w:ind w:left="360"/>
         <w:rPr>
           <w:rFonts w:ascii="Times New Roman" w:hAnsi="Times New Roman" w:cs="Times New Roman"/>
@@ -201,7 +202,15 @@
           <w:sz w:val="24"/>
           <w:szCs w:val="24"/>
         </w:rPr>
-        <w:t>C. Boolean</w:t>
+        <w:t xml:space="preserve"> Boolean</w:t>
+      </w:r>
+      <w:r>
+        <w:rPr>
+          <w:rFonts w:ascii="Times New Roman" w:hAnsi="Times New Roman" w:cs="Times New Roman"/>
+          <w:sz w:val="24"/>
+          <w:szCs w:val="24"/>
+        </w:rPr>
+        <w:tab/>
       </w:r>
     </w:p>
     <w:p>
@@ -218,15 +227,7 @@
           <w:sz w:val="24"/>
           <w:szCs w:val="24"/>
         </w:rPr>
-        <w:t xml:space="preserve">2. Operator yang </w:t>
-      </w:r>
-      <w:r>
-        <w:rPr>
-          <w:rFonts w:ascii="Times New Roman" w:hAnsi="Times New Roman" w:cs="Times New Roman"/>
-          <w:sz w:val="24"/>
-          <w:szCs w:val="24"/>
-        </w:rPr>
-        <w:t>digunakan untuk menguji kesamaan dua nilai dalam Python adalah ...</w:t>
+        <w:t>2. Operator yang digunakan untuk menguji kesamaan dua nilai dalam Python adalah ...</w:t>
       </w:r>
     </w:p>
     <w:p>
@@ -236,6 +237,7 @@
           <w:ilvl w:val="0"/>
           <w:numId w:val="0"/>
         </w:numPr>
+        <w:shd w:val="clear" w:color="auto" w:fill="FFFF00"/>
         <w:ind w:left="360"/>
         <w:rPr>
           <w:rFonts w:ascii="Times New Roman" w:hAnsi="Times New Roman" w:cs="Times New Roman"/>
@@ -249,7 +251,7 @@
           <w:sz w:val="24"/>
           <w:szCs w:val="24"/>
         </w:rPr>
-        <w:t>B. ==</w:t>
+        <w:t>==</w:t>
       </w:r>
     </w:p>
     <w:p>
@@ -266,17 +268,30 @@
           <w:sz w:val="24"/>
           <w:szCs w:val="24"/>
         </w:rPr>
-        <w:t>3. Apa perbedaan utama antara = dan == dalam Python?</w:t>
+        <w:t xml:space="preserve">3. Apa perbedaan utama antara = dan == </w:t>
+      </w:r>
+      <w:proofErr w:type="spellStart"/>
+      <w:r>
+        <w:rPr>
+          <w:rFonts w:ascii="Times New Roman" w:hAnsi="Times New Roman" w:cs="Times New Roman"/>
+          <w:sz w:val="24"/>
+          <w:szCs w:val="24"/>
+        </w:rPr>
+        <w:t>dalam</w:t>
+      </w:r>
+      <w:proofErr w:type="spellEnd"/>
+      <w:r>
+        <w:rPr>
+          <w:rFonts w:ascii="Times New Roman" w:hAnsi="Times New Roman" w:cs="Times New Roman"/>
+          <w:sz w:val="24"/>
+          <w:szCs w:val="24"/>
+        </w:rPr>
+        <w:t xml:space="preserve"> Python?</w:t>
       </w:r>
     </w:p>
     <w:p>
       <w:pPr>
-        <w:pStyle w:val="ListBullet"/>
-        <w:numPr>
-          <w:ilvl w:val="0"/>
-          <w:numId w:val="0"/>
-        </w:numPr>
-        <w:ind w:left="360"/>
+        <w:shd w:val="clear" w:color="auto" w:fill="FFFF00"/>
         <w:rPr>
           <w:rFonts w:ascii="Times New Roman" w:hAnsi="Times New Roman" w:cs="Times New Roman"/>
           <w:sz w:val="24"/>
@@ -289,7 +304,15 @@
           <w:sz w:val="24"/>
           <w:szCs w:val="24"/>
         </w:rPr>
-        <w:t>B. = untuk penugasan, == untuk menguji kesamaan</w:t>
+        <w:t xml:space="preserve">     </w:t>
+      </w:r>
+      <w:r>
+        <w:rPr>
+          <w:rFonts w:ascii="Times New Roman" w:hAnsi="Times New Roman" w:cs="Times New Roman"/>
+          <w:sz w:val="24"/>
+          <w:szCs w:val="24"/>
+        </w:rPr>
+        <w:t xml:space="preserve"> = untuk penugasan, == untuk menguji kesamaan</w:t>
       </w:r>
     </w:p>
     <w:p>
@@ -316,6 +339,7 @@
           <w:ilvl w:val="0"/>
           <w:numId w:val="0"/>
         </w:numPr>
+        <w:shd w:val="clear" w:color="auto" w:fill="FFFF00"/>
         <w:ind w:left="360"/>
         <w:rPr>
           <w:rFonts w:ascii="Times New Roman" w:hAnsi="Times New Roman" w:cs="Times New Roman"/>
@@ -329,15 +353,61 @@
           <w:sz w:val="24"/>
           <w:szCs w:val="24"/>
         </w:rPr>
-        <w:t>C.</w:t>
+        <w:t xml:space="preserve">Tidak, </w:t>
       </w:r>
+      <w:proofErr w:type="spellStart"/>
       <w:r>
         <w:rPr>
           <w:rFonts w:ascii="Times New Roman" w:hAnsi="Times New Roman" w:cs="Times New Roman"/>
           <w:sz w:val="24"/>
           <w:szCs w:val="24"/>
         </w:rPr>
-        <w:t xml:space="preserve"> Tidak, karena nilai tepat 75 tidak akan diterima</w:t>
+        <w:t>karena</w:t>
+      </w:r>
+      <w:proofErr w:type="spellEnd"/>
+      <w:r>
+        <w:rPr>
+          <w:rFonts w:ascii="Times New Roman" w:hAnsi="Times New Roman" w:cs="Times New Roman"/>
+          <w:sz w:val="24"/>
+          <w:szCs w:val="24"/>
+        </w:rPr>
+        <w:t xml:space="preserve"> </w:t>
+      </w:r>
+      <w:proofErr w:type="spellStart"/>
+      <w:r>
+        <w:rPr>
+          <w:rFonts w:ascii="Times New Roman" w:hAnsi="Times New Roman" w:cs="Times New Roman"/>
+          <w:sz w:val="24"/>
+          <w:szCs w:val="24"/>
+        </w:rPr>
+        <w:t>nilai</w:t>
+      </w:r>
+      <w:proofErr w:type="spellEnd"/>
+      <w:r>
+        <w:rPr>
+          <w:rFonts w:ascii="Times New Roman" w:hAnsi="Times New Roman" w:cs="Times New Roman"/>
+          <w:sz w:val="24"/>
+          <w:szCs w:val="24"/>
+        </w:rPr>
+        <w:t xml:space="preserve"> </w:t>
+      </w:r>
+      <w:proofErr w:type="spellStart"/>
+      <w:r>
+        <w:rPr>
+          <w:rFonts w:ascii="Times New Roman" w:hAnsi="Times New Roman" w:cs="Times New Roman"/>
+          <w:sz w:val="24"/>
+          <w:szCs w:val="24"/>
+        </w:rPr>
+        <w:t>tepat</w:t>
+      </w:r>
+      <w:proofErr w:type="spellEnd"/>
+      <w:r>
+        <w:rPr>
+          <w:rFonts w:ascii="Times New Roman" w:hAnsi="Times New Roman" w:cs="Times New Roman"/>
+          <w:sz w:val="24"/>
+          <w:szCs w:val="24"/>
+        </w:rPr>
+        <w:t xml:space="preserve"> 75 tidak akan diterima</w:t>
       </w:r>
     </w:p>
     <w:p>
@@ -364,6 +434,7 @@
           <w:ilvl w:val="0"/>
           <w:numId w:val="0"/>
         </w:numPr>
+        <w:shd w:val="clear" w:color="auto" w:fill="FFFF00"/>
         <w:ind w:left="360"/>
         <w:rPr>
           <w:rFonts w:ascii="Times New Roman" w:hAnsi="Times New Roman" w:cs="Times New Roman"/>
@@ -377,7 +448,43 @@
           <w:sz w:val="24"/>
           <w:szCs w:val="24"/>
         </w:rPr>
-        <w:t>B. Saat kondisi if bernilai False</w:t>
+        <w:t xml:space="preserve">Saat </w:t>
+      </w:r>
+      <w:proofErr w:type="spellStart"/>
+      <w:r>
+        <w:rPr>
+          <w:rFonts w:ascii="Times New Roman" w:hAnsi="Times New Roman" w:cs="Times New Roman"/>
+          <w:sz w:val="24"/>
+          <w:szCs w:val="24"/>
+        </w:rPr>
+        <w:t>kondisi</w:t>
+      </w:r>
+      <w:proofErr w:type="spellEnd"/>
+      <w:r>
+        <w:rPr>
+          <w:rFonts w:ascii="Times New Roman" w:hAnsi="Times New Roman" w:cs="Times New Roman"/>
+          <w:sz w:val="24"/>
+          <w:szCs w:val="24"/>
+        </w:rPr>
+        <w:t xml:space="preserve"> if </w:t>
+      </w:r>
+      <w:proofErr w:type="spellStart"/>
+      <w:r>
+        <w:rPr>
+          <w:rFonts w:ascii="Times New Roman" w:hAnsi="Times New Roman" w:cs="Times New Roman"/>
+          <w:sz w:val="24"/>
+          <w:szCs w:val="24"/>
+        </w:rPr>
+        <w:t>bernilai</w:t>
+      </w:r>
+      <w:proofErr w:type="spellEnd"/>
+      <w:r>
+        <w:rPr>
+          <w:rFonts w:ascii="Times New Roman" w:hAnsi="Times New Roman" w:cs="Times New Roman"/>
+          <w:sz w:val="24"/>
+          <w:szCs w:val="24"/>
+        </w:rPr>
+        <w:t xml:space="preserve"> False</w:t>
       </w:r>
     </w:p>
     <w:p>
@@ -423,6 +530,7 @@
           <w:ilvl w:val="0"/>
           <w:numId w:val="0"/>
         </w:numPr>
+        <w:shd w:val="clear" w:color="auto" w:fill="FFFF00"/>
         <w:ind w:left="360"/>
         <w:rPr>
           <w:rFonts w:ascii="Times New Roman" w:hAnsi="Times New Roman" w:cs="Times New Roman"/>
@@ -436,8 +544,36 @@
           <w:sz w:val="24"/>
           <w:szCs w:val="24"/>
         </w:rPr>
-        <w:t>A. 0, sehingga 14 genap</w:t>
+        <w:t xml:space="preserve">0, </w:t>
       </w:r>
+      <w:proofErr w:type="spellStart"/>
+      <w:r>
+        <w:rPr>
+          <w:rFonts w:ascii="Times New Roman" w:hAnsi="Times New Roman" w:cs="Times New Roman"/>
+          <w:sz w:val="24"/>
+          <w:szCs w:val="24"/>
+        </w:rPr>
+        <w:t>sehingga</w:t>
+      </w:r>
+      <w:proofErr w:type="spellEnd"/>
+      <w:r>
+        <w:rPr>
+          <w:rFonts w:ascii="Times New Roman" w:hAnsi="Times New Roman" w:cs="Times New Roman"/>
+          <w:sz w:val="24"/>
+          <w:szCs w:val="24"/>
+        </w:rPr>
+        <w:t xml:space="preserve"> 14 </w:t>
+      </w:r>
+      <w:proofErr w:type="spellStart"/>
+      <w:r>
+        <w:rPr>
+          <w:rFonts w:ascii="Times New Roman" w:hAnsi="Times New Roman" w:cs="Times New Roman"/>
+          <w:sz w:val="24"/>
+          <w:szCs w:val="24"/>
+        </w:rPr>
+        <w:t>genap</w:t>
+      </w:r>
+      <w:proofErr w:type="spellEnd"/>
     </w:p>
     <w:p>
       <w:pPr>
@@ -453,15 +589,7 @@
           <w:sz w:val="24"/>
           <w:szCs w:val="24"/>
         </w:rPr>
-        <w:t>7. Operator logika yang tep</w:t>
-      </w:r>
-      <w:r>
-        <w:rPr>
-          <w:rFonts w:ascii="Times New Roman" w:hAnsi="Times New Roman" w:cs="Times New Roman"/>
-          <w:sz w:val="24"/>
-          <w:szCs w:val="24"/>
-        </w:rPr>
-        <w:t>at untuk menyatakan nilai &gt;= 60 dan kehadiran &gt;= 80% secara bersamaan adalah ...</w:t>
+        <w:t>7. Operator logika yang tepat untuk menyatakan nilai &gt;= 60 dan kehadiran &gt;= 80% secara bersamaan adalah ...</w:t>
       </w:r>
     </w:p>
     <w:p>
@@ -471,6 +599,7 @@
           <w:ilvl w:val="0"/>
           <w:numId w:val="0"/>
         </w:numPr>
+        <w:shd w:val="clear" w:color="auto" w:fill="FFFF00"/>
         <w:ind w:left="360"/>
         <w:rPr>
           <w:rFonts w:ascii="Times New Roman" w:hAnsi="Times New Roman" w:cs="Times New Roman"/>
@@ -484,7 +613,7 @@
           <w:sz w:val="24"/>
           <w:szCs w:val="24"/>
         </w:rPr>
-        <w:t>C. and</w:t>
+        <w:t xml:space="preserve"> and</w:t>
       </w:r>
     </w:p>
     <w:p>
@@ -512,6 +641,7 @@
           <w:ilvl w:val="0"/>
           <w:numId w:val="0"/>
         </w:numPr>
+        <w:shd w:val="clear" w:color="auto" w:fill="FFFF00"/>
         <w:ind w:left="360"/>
         <w:rPr>
           <w:rFonts w:ascii="Times New Roman" w:hAnsi="Times New Roman" w:cs="Times New Roman"/>
@@ -525,15 +655,74 @@
           <w:sz w:val="24"/>
           <w:szCs w:val="24"/>
         </w:rPr>
-        <w:t>A. Karena nested if memungkinkan pemeri</w:t>
+        <w:t xml:space="preserve"> </w:t>
       </w:r>
       <w:r>
-        <w:rPr>
-          <w:rFonts w:ascii="Times New Roman" w:hAnsi="Times New Roman" w:cs="Times New Roman"/>
-          <w:sz w:val="24"/>
-          <w:szCs w:val="24"/>
-        </w:rPr>
-        <w:t>ksaan kondisi kedua di dalam kondisi pertama</w:t>
+        <w:t xml:space="preserve">Karena </w:t>
+      </w:r>
+      <w:proofErr w:type="spellStart"/>
+      <w:r>
+        <w:t>kondisi</w:t>
+      </w:r>
+      <w:proofErr w:type="spellEnd"/>
+      <w:r>
+        <w:t xml:space="preserve"> </w:t>
+      </w:r>
+      <w:proofErr w:type="spellStart"/>
+      <w:r>
+        <w:t>kedua</w:t>
+      </w:r>
+      <w:proofErr w:type="spellEnd"/>
+      <w:r>
+        <w:t xml:space="preserve"> </w:t>
+      </w:r>
+      <w:proofErr w:type="spellStart"/>
+      <w:r>
+        <w:t>hanya</w:t>
+      </w:r>
+      <w:proofErr w:type="spellEnd"/>
+      <w:r>
+        <w:t xml:space="preserve"> </w:t>
+      </w:r>
+      <w:proofErr w:type="spellStart"/>
+      <w:r>
+        <w:t>diperiksa</w:t>
+      </w:r>
+      <w:proofErr w:type="spellEnd"/>
+      <w:r>
+        <w:t xml:space="preserve"> </w:t>
+      </w:r>
+      <w:proofErr w:type="spellStart"/>
+      <w:r>
+        <w:t>setelah</w:t>
+      </w:r>
+      <w:proofErr w:type="spellEnd"/>
+      <w:r>
+        <w:t xml:space="preserve"> </w:t>
+      </w:r>
+      <w:proofErr w:type="spellStart"/>
+      <w:r>
+        <w:t>kondisi</w:t>
+      </w:r>
+      <w:proofErr w:type="spellEnd"/>
+      <w:r>
+        <w:t xml:space="preserve"> </w:t>
+      </w:r>
+      <w:proofErr w:type="spellStart"/>
+      <w:r>
+        <w:t>pertama</w:t>
+      </w:r>
+      <w:proofErr w:type="spellEnd"/>
+      <w:r>
+        <w:t xml:space="preserve"> </w:t>
+      </w:r>
+      <w:proofErr w:type="spellStart"/>
+      <w:r>
+        <w:t>terpenuhi</w:t>
+      </w:r>
+      <w:proofErr w:type="spellEnd"/>
+      <w:r>
+        <w:t>.</w:t>
       </w:r>
     </w:p>
     <w:p>
@@ -550,15 +739,7 @@
           <w:sz w:val="24"/>
           <w:szCs w:val="24"/>
         </w:rPr>
-        <w:t>9. Tiga nilai yang tepat untuk menguj</w:t>
-      </w:r>
-      <w:r>
-        <w:rPr>
-          <w:rFonts w:ascii="Times New Roman" w:hAnsi="Times New Roman" w:cs="Times New Roman"/>
-          <w:sz w:val="24"/>
-          <w:szCs w:val="24"/>
-        </w:rPr>
-        <w:t>i batas kelulusan nilai minimal 60 adalah ...</w:t>
+        <w:t>9. Tiga nilai yang tepat untuk menguji batas kelulusan nilai minimal 60 adalah ...</w:t>
       </w:r>
     </w:p>
     <w:p>
@@ -568,6 +749,7 @@
           <w:ilvl w:val="0"/>
           <w:numId w:val="0"/>
         </w:numPr>
+        <w:shd w:val="clear" w:color="auto" w:fill="FFFF00"/>
         <w:ind w:left="360"/>
         <w:rPr>
           <w:rFonts w:ascii="Times New Roman" w:hAnsi="Times New Roman" w:cs="Times New Roman"/>
@@ -581,7 +763,7 @@
           <w:sz w:val="24"/>
           <w:szCs w:val="24"/>
         </w:rPr>
-        <w:t>B. 59, 60, 61</w:t>
+        <w:t>59, 60, 61</w:t>
       </w:r>
     </w:p>
     <w:p>
@@ -617,15 +799,7 @@
           <w:sz w:val="24"/>
           <w:szCs w:val="24"/>
         </w:rPr>
-        <w:t xml:space="preserve">10. Setelah commit lokal pertama dibuat dan remote sudah terhubung, perintah Git yang digunakan untuk mengirim commit lokal ke repository remote </w:t>
-      </w:r>
-      <w:r>
-        <w:rPr>
-          <w:rFonts w:ascii="Times New Roman" w:hAnsi="Times New Roman" w:cs="Times New Roman"/>
-          <w:sz w:val="24"/>
-          <w:szCs w:val="24"/>
-        </w:rPr>
-        <w:t>adalah ...</w:t>
+        <w:t>10. Setelah commit lokal pertama dibuat dan remote sudah terhubung, perintah Git yang digunakan untuk mengirim commit lokal ke repository remote adalah ...</w:t>
       </w:r>
     </w:p>
     <w:p>
@@ -635,6 +809,7 @@
           <w:ilvl w:val="0"/>
           <w:numId w:val="0"/>
         </w:numPr>
+        <w:shd w:val="clear" w:color="auto" w:fill="FFFF00"/>
         <w:ind w:left="360"/>
         <w:rPr>
           <w:rFonts w:ascii="Times New Roman" w:hAnsi="Times New Roman" w:cs="Times New Roman"/>
@@ -648,7 +823,7 @@
           <w:sz w:val="24"/>
           <w:szCs w:val="24"/>
         </w:rPr>
-        <w:t>D. git push</w:t>
+        <w:t>git push</w:t>
       </w:r>
     </w:p>
     <w:sectPr>
@@ -1149,11 +1324,6 @@
     <w:lsdException w:name="Book Title" w:uiPriority="33" w:qFormat="1"/>
     <w:lsdException w:name="Bibliography" w:semiHidden="1" w:uiPriority="37" w:unhideWhenUsed="1"/>
     <w:lsdException w:name="TOC Heading" w:semiHidden="1" w:uiPriority="39" w:unhideWhenUsed="1" w:qFormat="1"/>
-    <w:lsdException w:name="Plain Table 5" w:semiHidden="1" w:unhideWhenUsed="1"/>
-    <w:lsdException w:name="Grid Table Light" w:semiHidden="1" w:unhideWhenUsed="1"/>
-    <w:lsdException w:name="Grid Table 1 Light" w:semiHidden="1" w:unhideWhenUsed="1"/>
-    <w:lsdException w:name="Grid Table 2" w:semiHidden="1" w:unhideWhenUsed="1"/>
-    <w:lsdException w:name="Grid Table 3" w:semiHidden="1" w:unhideWhenUsed="1"/>
     <w:lsdException w:name="Grid Table 4" w:uiPriority="49"/>
     <w:lsdException w:name="Grid Table 5 Dark" w:uiPriority="50"/>
     <w:lsdException w:name="Grid Table 6 Colorful" w:uiPriority="51"/>

</xml_diff>